<commit_message>
Guide : Chrome peut réclamer un clic sur un poste neuf
Sa décision se fonde sur l'usage déjà fait du site, et ce crédit part de zéro
sur une machine qui vient d'être installée. L'écran peut donc réclamer un clic
les premiers jours avant de se déclencher seul — ce qui se découvrirait le jour
de la mise en service. Edge avec « Autoriser » est déterministe, là où Chrome
dépend d'un historique.
</commit_message>
<xml_diff>
--- a/GUIDE_UTILISATION.docx
+++ b/GUIDE_UTILISATION.docx
@@ -5727,6 +5727,48 @@
     <w:p>
       <w:pPr>
         <w:pStyle w:val="FirstParagraph"/>
+      </w:pPr>
+      <w:r>
+        <w:rPr>
+          <w:b/>
+          <w:bCs/>
+        </w:rPr>
+        <w:t xml:space="preserve">Sur un poste neuf, prévoyez le cas.</w:t>
+      </w:r>
+      <w:r>
+        <w:t xml:space="preserve"> </w:t>
+      </w:r>
+      <w:r>
+        <w:t xml:space="preserve">Chrome fonde sa décision sur l’usage déjà fait du site : ce</w:t>
+      </w:r>
+      <w:r>
+        <w:t xml:space="preserve"> </w:t>
+      </w:r>
+      <w:r>
+        <w:t xml:space="preserve">crédit part de zéro sur une machine qui vient d’être installée, et la sirène peut y réclamer un clic</w:t>
+      </w:r>
+      <w:r>
+        <w:t xml:space="preserve"> </w:t>
+      </w:r>
+      <w:r>
+        <w:t xml:space="preserve">les premiers jours, avant de se déclencher seule. Si l’écran doit être fiable dès le premier jour,</w:t>
+      </w:r>
+      <w:r>
+        <w:t xml:space="preserve"> </w:t>
+      </w:r>
+      <w:r>
+        <w:t xml:space="preserve">utilisez Edge avec le réglage ci-dessus — il est déterministe, là où celui de Chrome dépend d’un</w:t>
+      </w:r>
+      <w:r>
+        <w:t xml:space="preserve"> </w:t>
+      </w:r>
+      <w:r>
+        <w:t xml:space="preserve">historique.</w:t>
+      </w:r>
+    </w:p>
+    <w:p>
+      <w:pPr>
+        <w:pStyle w:val="Corpsdetexte"/>
       </w:pPr>
       <w:r>
         <w:t xml:space="preserve">À défaut, un simple clic n’importe où dans la page lève le blocage — mais pour la session</w:t>

</xml_diff>